<commit_message>
Update resume to latest version
</commit_message>
<xml_diff>
--- a/public/resume.docx
+++ b/public/resume.docx
@@ -450,36 +450,7 @@
                   <w:sz w:val="18"/>
                   <w:szCs w:val="18"/>
                 </w:rPr>
-                <w:t>Kundan-code</w:t>
-              </w:r>
-              <w:r>
-                <w:rPr>
-                  <w:rStyle w:val="Hyperlink"/>
-                  <w:rFonts w:ascii="Calibri" w:eastAsia="Calibri" w:hAnsi="Calibri" w:cs="Calibri"/>
-                  <w:sz w:val="18"/>
-                  <w:szCs w:val="18"/>
-                </w:rPr>
-                <w:t>7 (</w:t>
-              </w:r>
-              <w:proofErr w:type="spellStart"/>
-              <w:r>
-                <w:rPr>
-                  <w:rStyle w:val="Hyperlink"/>
-                  <w:rFonts w:ascii="Calibri" w:eastAsia="Calibri" w:hAnsi="Calibri" w:cs="Calibri"/>
-                  <w:sz w:val="18"/>
-                  <w:szCs w:val="18"/>
-                </w:rPr>
-                <w:t>Github</w:t>
-              </w:r>
-              <w:proofErr w:type="spellEnd"/>
-              <w:r>
-                <w:rPr>
-                  <w:rStyle w:val="Hyperlink"/>
-                  <w:rFonts w:ascii="Calibri" w:eastAsia="Calibri" w:hAnsi="Calibri" w:cs="Calibri"/>
-                  <w:sz w:val="18"/>
-                  <w:szCs w:val="18"/>
-                </w:rPr>
-                <w:t>)</w:t>
+                <w:t>kundannetke8.vercel.app(portfolio)</w:t>
               </w:r>
             </w:hyperlink>
           </w:p>
@@ -1194,16 +1165,6 @@
     </w:p>
     <w:p>
       <w:pPr>
-        <w:spacing w:after="20"/>
-        <w:rPr>
-          <w:rFonts w:ascii="Calibri" w:eastAsia="Calibri" w:hAnsi="Calibri" w:cs="Calibri"/>
-          <w:sz w:val="19"/>
-          <w:szCs w:val="19"/>
-        </w:rPr>
-      </w:pPr>
-    </w:p>
-    <w:p>
-      <w:pPr>
         <w:pStyle w:val="ListParagraph"/>
         <w:numPr>
           <w:ilvl w:val="0"/>
@@ -1295,6 +1256,21 @@
           <w:tab w:val="right" w:pos="9026"/>
         </w:tabs>
         <w:spacing w:after="20"/>
+        <w:rPr>
+          <w:rFonts w:ascii="Calibri" w:eastAsia="Calibri" w:hAnsi="Calibri" w:cs="Calibri"/>
+          <w:b/>
+          <w:bCs/>
+          <w:sz w:val="19"/>
+          <w:szCs w:val="19"/>
+        </w:rPr>
+      </w:pPr>
+    </w:p>
+    <w:p>
+      <w:pPr>
+        <w:tabs>
+          <w:tab w:val="right" w:pos="9026"/>
+        </w:tabs>
+        <w:spacing w:after="20"/>
       </w:pPr>
       <w:r>
         <w:rPr>
@@ -1489,6 +1465,302 @@
     </w:p>
     <w:p>
       <w:pPr>
+        <w:spacing w:after="40"/>
+        <w:rPr>
+          <w:rFonts w:asciiTheme="minorHAnsi" w:hAnsiTheme="minorHAnsi" w:cstheme="minorHAnsi"/>
+          <w:b/>
+          <w:bCs/>
+          <w:lang w:val="en-IN"/>
+        </w:rPr>
+      </w:pPr>
+    </w:p>
+    <w:p>
+      <w:pPr>
+        <w:spacing w:after="40"/>
+        <w:rPr>
+          <w:rFonts w:asciiTheme="minorHAnsi" w:hAnsiTheme="minorHAnsi" w:cstheme="minorHAnsi"/>
+          <w:lang w:val="en-IN"/>
+        </w:rPr>
+      </w:pPr>
+      <w:proofErr w:type="spellStart"/>
+      <w:r>
+        <w:rPr>
+          <w:rFonts w:asciiTheme="minorHAnsi" w:hAnsiTheme="minorHAnsi" w:cstheme="minorHAnsi"/>
+          <w:b/>
+          <w:bCs/>
+          <w:lang w:val="en-IN"/>
+        </w:rPr>
+        <w:t>CatEye</w:t>
+      </w:r>
+      <w:proofErr w:type="spellEnd"/>
+      <w:r>
+        <w:rPr>
+          <w:rFonts w:asciiTheme="minorHAnsi" w:hAnsiTheme="minorHAnsi" w:cstheme="minorHAnsi"/>
+          <w:b/>
+          <w:bCs/>
+          <w:lang w:val="en-IN"/>
+        </w:rPr>
+        <w:t xml:space="preserve"> – Background Video Recorder</w:t>
+      </w:r>
+      <w:r>
+        <w:rPr>
+          <w:lang w:val="en-IN"/>
+        </w:rPr>
+        <w:t xml:space="preserve"> </w:t>
+      </w:r>
+      <w:r>
+        <w:rPr>
+          <w:rFonts w:asciiTheme="minorHAnsi" w:hAnsiTheme="minorHAnsi" w:cstheme="minorHAnsi"/>
+          <w:lang w:val="en-IN"/>
+        </w:rPr>
+        <w:t>— Android Developer</w:t>
+      </w:r>
+      <w:r>
+        <w:rPr>
+          <w:rFonts w:asciiTheme="minorHAnsi" w:hAnsiTheme="minorHAnsi" w:cstheme="minorHAnsi"/>
+          <w:lang w:val="en-IN"/>
+        </w:rPr>
+        <w:tab/>
+      </w:r>
+      <w:r>
+        <w:rPr>
+          <w:rFonts w:asciiTheme="minorHAnsi" w:hAnsiTheme="minorHAnsi" w:cstheme="minorHAnsi"/>
+          <w:lang w:val="en-IN"/>
+        </w:rPr>
+        <w:tab/>
+      </w:r>
+      <w:r>
+        <w:rPr>
+          <w:rFonts w:asciiTheme="minorHAnsi" w:hAnsiTheme="minorHAnsi" w:cstheme="minorHAnsi"/>
+          <w:lang w:val="en-IN"/>
+        </w:rPr>
+        <w:tab/>
+      </w:r>
+      <w:r>
+        <w:rPr>
+          <w:rFonts w:asciiTheme="minorHAnsi" w:hAnsiTheme="minorHAnsi" w:cstheme="minorHAnsi"/>
+          <w:lang w:val="en-IN"/>
+        </w:rPr>
+        <w:tab/>
+      </w:r>
+      <w:r>
+        <w:rPr>
+          <w:rFonts w:asciiTheme="minorHAnsi" w:hAnsiTheme="minorHAnsi" w:cstheme="minorHAnsi"/>
+          <w:lang w:val="en-IN"/>
+        </w:rPr>
+        <w:tab/>
+      </w:r>
+      <w:r>
+        <w:rPr>
+          <w:rFonts w:asciiTheme="minorHAnsi" w:hAnsiTheme="minorHAnsi" w:cstheme="minorHAnsi"/>
+          <w:lang w:val="en-IN"/>
+        </w:rPr>
+        <w:tab/>
+      </w:r>
+      <w:r>
+        <w:rPr>
+          <w:rFonts w:asciiTheme="minorHAnsi" w:hAnsiTheme="minorHAnsi" w:cstheme="minorHAnsi"/>
+          <w:lang w:val="en-IN"/>
+        </w:rPr>
+        <w:tab/>
+      </w:r>
+      <w:hyperlink r:id="rId10" w:history="1">
+        <w:r>
+          <w:rPr>
+            <w:rStyle w:val="Hyperlink"/>
+            <w:rFonts w:asciiTheme="minorHAnsi" w:hAnsiTheme="minorHAnsi" w:cstheme="minorHAnsi"/>
+            <w:lang w:val="en-IN"/>
+          </w:rPr>
+          <w:t>Release</w:t>
+        </w:r>
+      </w:hyperlink>
+      <w:r>
+        <w:rPr>
+          <w:rFonts w:asciiTheme="minorHAnsi" w:hAnsiTheme="minorHAnsi" w:cstheme="minorHAnsi"/>
+          <w:lang w:val="en-IN"/>
+        </w:rPr>
+        <w:br/>
+        <w:t xml:space="preserve">Android | Kotlin | </w:t>
+      </w:r>
+      <w:proofErr w:type="spellStart"/>
+      <w:r>
+        <w:rPr>
+          <w:rFonts w:asciiTheme="minorHAnsi" w:hAnsiTheme="minorHAnsi" w:cstheme="minorHAnsi"/>
+          <w:lang w:val="en-IN"/>
+        </w:rPr>
+        <w:t>CameraX</w:t>
+      </w:r>
+      <w:proofErr w:type="spellEnd"/>
+      <w:r>
+        <w:rPr>
+          <w:rFonts w:asciiTheme="minorHAnsi" w:hAnsiTheme="minorHAnsi" w:cstheme="minorHAnsi"/>
+          <w:lang w:val="en-IN"/>
+        </w:rPr>
+        <w:t xml:space="preserve"> | Foreground Service | </w:t>
+      </w:r>
+      <w:proofErr w:type="spellStart"/>
+      <w:r>
+        <w:rPr>
+          <w:rFonts w:asciiTheme="minorHAnsi" w:hAnsiTheme="minorHAnsi" w:cstheme="minorHAnsi"/>
+          <w:lang w:val="en-IN"/>
+        </w:rPr>
+        <w:t>MediaRecorder</w:t>
+      </w:r>
+      <w:proofErr w:type="spellEnd"/>
+    </w:p>
+    <w:p>
+      <w:pPr>
+        <w:numPr>
+          <w:ilvl w:val="0"/>
+          <w:numId w:val="5"/>
+        </w:numPr>
+        <w:spacing w:after="40"/>
+        <w:rPr>
+          <w:rFonts w:asciiTheme="minorHAnsi" w:hAnsiTheme="minorHAnsi" w:cstheme="minorHAnsi"/>
+          <w:lang w:val="en-IN"/>
+        </w:rPr>
+      </w:pPr>
+      <w:r>
+        <w:rPr>
+          <w:rFonts w:asciiTheme="minorHAnsi" w:hAnsiTheme="minorHAnsi" w:cstheme="minorHAnsi"/>
+          <w:lang w:val="en-IN"/>
+        </w:rPr>
+        <w:t xml:space="preserve">Built </w:t>
+      </w:r>
+      <w:proofErr w:type="spellStart"/>
+      <w:r>
+        <w:rPr>
+          <w:rFonts w:asciiTheme="minorHAnsi" w:hAnsiTheme="minorHAnsi" w:cstheme="minorHAnsi"/>
+          <w:b/>
+          <w:bCs/>
+          <w:lang w:val="en-IN"/>
+        </w:rPr>
+        <w:t>CatEye</w:t>
+      </w:r>
+      <w:proofErr w:type="spellEnd"/>
+      <w:r>
+        <w:rPr>
+          <w:rFonts w:asciiTheme="minorHAnsi" w:hAnsiTheme="minorHAnsi" w:cstheme="minorHAnsi"/>
+          <w:lang w:val="en-IN"/>
+        </w:rPr>
+        <w:t xml:space="preserve">, an Android application for recording video in the background using </w:t>
+      </w:r>
+      <w:proofErr w:type="spellStart"/>
+      <w:r>
+        <w:rPr>
+          <w:rFonts w:asciiTheme="minorHAnsi" w:hAnsiTheme="minorHAnsi" w:cstheme="minorHAnsi"/>
+          <w:b/>
+          <w:bCs/>
+          <w:lang w:val="en-IN"/>
+        </w:rPr>
+        <w:t>CameraX</w:t>
+      </w:r>
+      <w:proofErr w:type="spellEnd"/>
+      <w:r>
+        <w:rPr>
+          <w:rFonts w:asciiTheme="minorHAnsi" w:hAnsiTheme="minorHAnsi" w:cstheme="minorHAnsi"/>
+          <w:b/>
+          <w:bCs/>
+          <w:lang w:val="en-IN"/>
+        </w:rPr>
+        <w:t xml:space="preserve"> and foreground services</w:t>
+      </w:r>
+      <w:r>
+        <w:rPr>
+          <w:rFonts w:asciiTheme="minorHAnsi" w:hAnsiTheme="minorHAnsi" w:cstheme="minorHAnsi"/>
+          <w:lang w:val="en-IN"/>
+        </w:rPr>
+        <w:t xml:space="preserve">. </w:t>
+      </w:r>
+    </w:p>
+    <w:p>
+      <w:pPr>
+        <w:numPr>
+          <w:ilvl w:val="0"/>
+          <w:numId w:val="5"/>
+        </w:numPr>
+        <w:spacing w:after="40"/>
+        <w:rPr>
+          <w:rFonts w:asciiTheme="minorHAnsi" w:hAnsiTheme="minorHAnsi" w:cstheme="minorHAnsi"/>
+          <w:lang w:val="en-IN"/>
+        </w:rPr>
+      </w:pPr>
+      <w:r>
+        <w:rPr>
+          <w:rFonts w:asciiTheme="minorHAnsi" w:hAnsiTheme="minorHAnsi" w:cstheme="minorHAnsi"/>
+          <w:lang w:val="en-IN"/>
+        </w:rPr>
+        <w:t xml:space="preserve">Implemented continuous video recording with camera controls, audio capture, recording-quality options, and </w:t>
+      </w:r>
+      <w:r>
+        <w:rPr>
+          <w:rFonts w:asciiTheme="minorHAnsi" w:hAnsiTheme="minorHAnsi" w:cstheme="minorHAnsi"/>
+          <w:b/>
+          <w:bCs/>
+          <w:lang w:val="en-IN"/>
+        </w:rPr>
+        <w:t>local MP4 storage</w:t>
+      </w:r>
+      <w:r>
+        <w:rPr>
+          <w:rFonts w:asciiTheme="minorHAnsi" w:hAnsiTheme="minorHAnsi" w:cstheme="minorHAnsi"/>
+          <w:lang w:val="en-IN"/>
+        </w:rPr>
+        <w:t xml:space="preserve">. </w:t>
+      </w:r>
+    </w:p>
+    <w:p>
+      <w:pPr>
+        <w:numPr>
+          <w:ilvl w:val="0"/>
+          <w:numId w:val="5"/>
+        </w:numPr>
+        <w:spacing w:after="40"/>
+        <w:rPr>
+          <w:rFonts w:asciiTheme="minorHAnsi" w:hAnsiTheme="minorHAnsi" w:cstheme="minorHAnsi"/>
+          <w:lang w:val="en-IN"/>
+        </w:rPr>
+      </w:pPr>
+      <w:r>
+        <w:rPr>
+          <w:rFonts w:asciiTheme="minorHAnsi" w:hAnsiTheme="minorHAnsi" w:cstheme="minorHAnsi"/>
+          <w:lang w:val="en-IN"/>
+        </w:rPr>
+        <w:t xml:space="preserve">Developed a recording gallery with video previews/thumbnails and integrated Android foreground-service notifications for reliable background operation. </w:t>
+      </w:r>
+    </w:p>
+    <w:p>
+      <w:pPr>
+        <w:numPr>
+          <w:ilvl w:val="0"/>
+          <w:numId w:val="5"/>
+        </w:numPr>
+        <w:spacing w:after="40"/>
+        <w:rPr>
+          <w:rFonts w:asciiTheme="minorHAnsi" w:hAnsiTheme="minorHAnsi" w:cstheme="minorHAnsi"/>
+          <w:lang w:val="en-IN"/>
+        </w:rPr>
+      </w:pPr>
+      <w:r>
+        <w:rPr>
+          <w:rFonts w:asciiTheme="minorHAnsi" w:hAnsiTheme="minorHAnsi" w:cstheme="minorHAnsi"/>
+          <w:lang w:val="en-IN"/>
+        </w:rPr>
+        <w:t>Optimized camera preview and recording workflows to reduce lag and freezing during background/locked-screen usage.</w:t>
+      </w:r>
+    </w:p>
+    <w:p>
+      <w:pPr>
+        <w:spacing w:after="40"/>
+      </w:pPr>
+    </w:p>
+    <w:p>
+      <w:pPr>
+        <w:spacing w:after="40"/>
+      </w:pPr>
+    </w:p>
+    <w:p>
+      <w:pPr>
         <w:keepNext/>
         <w:keepLines/>
         <w:shd w:val="clear" w:color="auto" w:fill="D9D9D9"/>
@@ -1787,7 +2059,6 @@
           <w:b/>
           <w:bCs/>
         </w:rPr>
-        <w:lastRenderedPageBreak/>
         <w:t>CERTIFICATIONS</w:t>
       </w:r>
     </w:p>
@@ -2558,6 +2829,155 @@
     </w:lvl>
   </w:abstractNum>
   <w:abstractNum w:abstractNumId="2" w15:restartNumberingAfterBreak="0">
+    <w:nsid w:val="4BCF15CC"/>
+    <w:multiLevelType w:val="multilevel"/>
+    <w:tmpl w:val="DD663954"/>
+    <w:lvl w:ilvl="0">
+      <w:start w:val="1"/>
+      <w:numFmt w:val="bullet"/>
+      <w:lvlText w:val=""/>
+      <w:lvlJc w:val="left"/>
+      <w:pPr>
+        <w:tabs>
+          <w:tab w:val="num" w:pos="720"/>
+        </w:tabs>
+        <w:ind w:left="720" w:hanging="360"/>
+      </w:pPr>
+      <w:rPr>
+        <w:rFonts w:ascii="Symbol" w:hAnsi="Symbol" w:hint="default"/>
+        <w:sz w:val="20"/>
+      </w:rPr>
+    </w:lvl>
+    <w:lvl w:ilvl="1" w:tentative="1">
+      <w:start w:val="1"/>
+      <w:numFmt w:val="bullet"/>
+      <w:lvlText w:val="o"/>
+      <w:lvlJc w:val="left"/>
+      <w:pPr>
+        <w:tabs>
+          <w:tab w:val="num" w:pos="1440"/>
+        </w:tabs>
+        <w:ind w:left="1440" w:hanging="360"/>
+      </w:pPr>
+      <w:rPr>
+        <w:rFonts w:ascii="Courier New" w:hAnsi="Courier New" w:hint="default"/>
+        <w:sz w:val="20"/>
+      </w:rPr>
+    </w:lvl>
+    <w:lvl w:ilvl="2" w:tentative="1">
+      <w:start w:val="1"/>
+      <w:numFmt w:val="bullet"/>
+      <w:lvlText w:val=""/>
+      <w:lvlJc w:val="left"/>
+      <w:pPr>
+        <w:tabs>
+          <w:tab w:val="num" w:pos="2160"/>
+        </w:tabs>
+        <w:ind w:left="2160" w:hanging="360"/>
+      </w:pPr>
+      <w:rPr>
+        <w:rFonts w:ascii="Wingdings" w:hAnsi="Wingdings" w:hint="default"/>
+        <w:sz w:val="20"/>
+      </w:rPr>
+    </w:lvl>
+    <w:lvl w:ilvl="3" w:tentative="1">
+      <w:start w:val="1"/>
+      <w:numFmt w:val="bullet"/>
+      <w:lvlText w:val=""/>
+      <w:lvlJc w:val="left"/>
+      <w:pPr>
+        <w:tabs>
+          <w:tab w:val="num" w:pos="2880"/>
+        </w:tabs>
+        <w:ind w:left="2880" w:hanging="360"/>
+      </w:pPr>
+      <w:rPr>
+        <w:rFonts w:ascii="Wingdings" w:hAnsi="Wingdings" w:hint="default"/>
+        <w:sz w:val="20"/>
+      </w:rPr>
+    </w:lvl>
+    <w:lvl w:ilvl="4" w:tentative="1">
+      <w:start w:val="1"/>
+      <w:numFmt w:val="bullet"/>
+      <w:lvlText w:val=""/>
+      <w:lvlJc w:val="left"/>
+      <w:pPr>
+        <w:tabs>
+          <w:tab w:val="num" w:pos="3600"/>
+        </w:tabs>
+        <w:ind w:left="3600" w:hanging="360"/>
+      </w:pPr>
+      <w:rPr>
+        <w:rFonts w:ascii="Wingdings" w:hAnsi="Wingdings" w:hint="default"/>
+        <w:sz w:val="20"/>
+      </w:rPr>
+    </w:lvl>
+    <w:lvl w:ilvl="5" w:tentative="1">
+      <w:start w:val="1"/>
+      <w:numFmt w:val="bullet"/>
+      <w:lvlText w:val=""/>
+      <w:lvlJc w:val="left"/>
+      <w:pPr>
+        <w:tabs>
+          <w:tab w:val="num" w:pos="4320"/>
+        </w:tabs>
+        <w:ind w:left="4320" w:hanging="360"/>
+      </w:pPr>
+      <w:rPr>
+        <w:rFonts w:ascii="Wingdings" w:hAnsi="Wingdings" w:hint="default"/>
+        <w:sz w:val="20"/>
+      </w:rPr>
+    </w:lvl>
+    <w:lvl w:ilvl="6" w:tentative="1">
+      <w:start w:val="1"/>
+      <w:numFmt w:val="bullet"/>
+      <w:lvlText w:val=""/>
+      <w:lvlJc w:val="left"/>
+      <w:pPr>
+        <w:tabs>
+          <w:tab w:val="num" w:pos="5040"/>
+        </w:tabs>
+        <w:ind w:left="5040" w:hanging="360"/>
+      </w:pPr>
+      <w:rPr>
+        <w:rFonts w:ascii="Wingdings" w:hAnsi="Wingdings" w:hint="default"/>
+        <w:sz w:val="20"/>
+      </w:rPr>
+    </w:lvl>
+    <w:lvl w:ilvl="7" w:tentative="1">
+      <w:start w:val="1"/>
+      <w:numFmt w:val="bullet"/>
+      <w:lvlText w:val=""/>
+      <w:lvlJc w:val="left"/>
+      <w:pPr>
+        <w:tabs>
+          <w:tab w:val="num" w:pos="5760"/>
+        </w:tabs>
+        <w:ind w:left="5760" w:hanging="360"/>
+      </w:pPr>
+      <w:rPr>
+        <w:rFonts w:ascii="Wingdings" w:hAnsi="Wingdings" w:hint="default"/>
+        <w:sz w:val="20"/>
+      </w:rPr>
+    </w:lvl>
+    <w:lvl w:ilvl="8" w:tentative="1">
+      <w:start w:val="1"/>
+      <w:numFmt w:val="bullet"/>
+      <w:lvlText w:val=""/>
+      <w:lvlJc w:val="left"/>
+      <w:pPr>
+        <w:tabs>
+          <w:tab w:val="num" w:pos="6480"/>
+        </w:tabs>
+        <w:ind w:left="6480" w:hanging="360"/>
+      </w:pPr>
+      <w:rPr>
+        <w:rFonts w:ascii="Wingdings" w:hAnsi="Wingdings" w:hint="default"/>
+        <w:sz w:val="20"/>
+      </w:rPr>
+    </w:lvl>
+  </w:abstractNum>
+  <w:abstractNum w:abstractNumId="3" w15:restartNumberingAfterBreak="0">
     <w:nsid w:val="5B005881"/>
     <w:multiLevelType w:val="hybridMultilevel"/>
     <w:tmpl w:val="4E72BC9C"/>
@@ -2611,7 +3031,7 @@
       <w:lvlJc w:val="left"/>
     </w:lvl>
   </w:abstractNum>
-  <w:abstractNum w:abstractNumId="3" w15:restartNumberingAfterBreak="0">
+  <w:abstractNum w:abstractNumId="4" w15:restartNumberingAfterBreak="0">
     <w:nsid w:val="68A955FA"/>
     <w:multiLevelType w:val="hybridMultilevel"/>
     <w:tmpl w:val="25EACFE4"/>
@@ -2731,7 +3151,7 @@
     </w:lvlOverride>
   </w:num>
   <w:num w:numId="2" w16cid:durableId="1551922233">
-    <w:abstractNumId w:val="2"/>
+    <w:abstractNumId w:val="3"/>
     <w:lvlOverride w:ilvl="0">
       <w:startOverride w:val="1"/>
     </w:lvlOverride>
@@ -2740,7 +3160,10 @@
     <w:abstractNumId w:val="1"/>
   </w:num>
   <w:num w:numId="4" w16cid:durableId="730545347">
-    <w:abstractNumId w:val="3"/>
+    <w:abstractNumId w:val="4"/>
+  </w:num>
+  <w:num w:numId="5" w16cid:durableId="1586648844">
+    <w:abstractNumId w:val="2"/>
   </w:num>
 </w:numbering>
 </file>
@@ -3225,7 +3648,6 @@
   <w:style w:type="character" w:default="1" w:styleId="DefaultParagraphFont">
     <w:name w:val="Default Paragraph Font"/>
     <w:uiPriority w:val="1"/>
-    <w:semiHidden/>
     <w:unhideWhenUsed/>
   </w:style>
   <w:style w:type="table" w:default="1" w:styleId="TableNormal">

</xml_diff>

<commit_message>
Update portfolio and resume
</commit_message>
<xml_diff>
--- a/public/resume.docx
+++ b/public/resume.docx
@@ -176,22 +176,22 @@
                 <w:noProof/>
               </w:rPr>
               <w:drawing>
-                <wp:anchor distT="0" distB="0" distL="114300" distR="114300" simplePos="0" relativeHeight="251658240" behindDoc="1" locked="0" layoutInCell="1" allowOverlap="1" wp14:anchorId="6DC6A3A1" wp14:editId="4449EF71">
+                <wp:anchor distT="0" distB="0" distL="114300" distR="114300" simplePos="0" relativeHeight="251658240" behindDoc="1" locked="0" layoutInCell="1" allowOverlap="1" wp14:anchorId="6DC6A3A1" wp14:editId="57C7BFAC">
                   <wp:simplePos x="0" y="0"/>
                   <wp:positionH relativeFrom="column">
-                    <wp:posOffset>184150</wp:posOffset>
+                    <wp:posOffset>209550</wp:posOffset>
                   </wp:positionH>
                   <wp:positionV relativeFrom="paragraph">
                     <wp:posOffset>-1021715</wp:posOffset>
                   </wp:positionV>
-                  <wp:extent cx="827405" cy="1034415"/>
-                  <wp:effectExtent l="0" t="0" r="0" b="0"/>
+                  <wp:extent cx="775335" cy="1034415"/>
+                  <wp:effectExtent l="0" t="0" r="5715" b="0"/>
                   <wp:wrapTight wrapText="bothSides">
                     <wp:wrapPolygon edited="0">
                       <wp:start x="0" y="0"/>
                       <wp:lineTo x="0" y="21083"/>
-                      <wp:lineTo x="20887" y="21083"/>
-                      <wp:lineTo x="20887" y="0"/>
+                      <wp:lineTo x="21229" y="21083"/>
+                      <wp:lineTo x="21229" y="0"/>
                       <wp:lineTo x="0" y="0"/>
                     </wp:wrapPolygon>
                   </wp:wrapTight>
@@ -223,7 +223,7 @@
                         <pic:spPr bwMode="auto">
                           <a:xfrm>
                             <a:off x="0" y="0"/>
-                            <a:ext cx="827405" cy="1034415"/>
+                            <a:ext cx="775335" cy="1034415"/>
                           </a:xfrm>
                           <a:prstGeom prst="rect">
                             <a:avLst/>
@@ -597,23 +597,7 @@
           <w:sz w:val="19"/>
           <w:szCs w:val="19"/>
         </w:rPr>
-        <w:t xml:space="preserve">                                                                                                                                </w:t>
-      </w:r>
-      <w:r>
-        <w:rPr>
-          <w:rFonts w:ascii="Calibri" w:eastAsia="Calibri" w:hAnsi="Calibri" w:cs="Calibri"/>
-          <w:sz w:val="19"/>
-          <w:szCs w:val="19"/>
-        </w:rPr>
-        <w:t xml:space="preserve">      </w:t>
-      </w:r>
-      <w:r>
-        <w:rPr>
-          <w:rFonts w:ascii="Calibri" w:eastAsia="Calibri" w:hAnsi="Calibri" w:cs="Calibri"/>
-          <w:sz w:val="19"/>
-          <w:szCs w:val="19"/>
-        </w:rPr>
-        <w:t xml:space="preserve">2025 - </w:t>
+        <w:t xml:space="preserve">                                                                                                                                2025 - </w:t>
       </w:r>
       <w:proofErr w:type="gramStart"/>
       <w:r>
@@ -622,15 +606,7 @@
           <w:sz w:val="19"/>
           <w:szCs w:val="19"/>
         </w:rPr>
-        <w:t xml:space="preserve">Present  </w:t>
-      </w:r>
-      <w:r>
-        <w:rPr>
-          <w:rFonts w:ascii="Calibri" w:eastAsia="Calibri" w:hAnsi="Calibri" w:cs="Calibri"/>
-          <w:sz w:val="19"/>
-          <w:szCs w:val="19"/>
-        </w:rPr>
-        <w:t>|</w:t>
+        <w:t>Present  |</w:t>
       </w:r>
       <w:proofErr w:type="gramEnd"/>
       <w:r>
@@ -639,17 +615,17 @@
           <w:sz w:val="19"/>
           <w:szCs w:val="19"/>
         </w:rPr>
-        <w:t xml:space="preserve"> </w:t>
-      </w:r>
-      <w:r>
-        <w:rPr>
-          <w:rFonts w:ascii="Calibri" w:eastAsia="Calibri" w:hAnsi="Calibri" w:cs="Calibri"/>
-          <w:b/>
-          <w:bCs/>
-          <w:sz w:val="19"/>
-          <w:szCs w:val="19"/>
-        </w:rPr>
-        <w:t>Pursing</w:t>
+        <w:t xml:space="preserve">  </w:t>
+      </w:r>
+      <w:r>
+        <w:rPr>
+          <w:rFonts w:ascii="Calibri" w:eastAsia="Calibri" w:hAnsi="Calibri" w:cs="Calibri"/>
+          <w:b/>
+          <w:bCs/>
+          <w:sz w:val="19"/>
+          <w:szCs w:val="19"/>
+        </w:rPr>
+        <w:t>CGPA – 6.9</w:t>
       </w:r>
     </w:p>
     <w:p>

</xml_diff>